<commit_message>
making notes of classbased component
</commit_message>
<xml_diff>
--- a/classbasedcomp.docx
+++ b/classbasedcomp.docx
@@ -1,13 +1,7 @@
 
 <file path=word/document.xml><?xml version="1.0" encoding="utf-8"?>
-<w:document xmlns:wpc="http://schemas.microsoft.com/office/word/2010/wordprocessingCanvas" xmlns:cx="http://schemas.microsoft.com/office/drawing/2014/chartex" xmlns:cx1="http://schemas.microsoft.com/office/drawing/2015/9/8/chartex" xmlns:cx2="http://schemas.microsoft.com/office/drawing/2015/10/21/chartex" xmlns:cx3="http://schemas.microsoft.com/office/drawing/2016/5/9/chartex" xmlns:cx4="http://schemas.microsoft.com/office/drawing/2016/5/10/chartex" xmlns:cx5="http://schemas.microsoft.com/office/drawing/2016/5/11/chartex" xmlns:cx6="http://schemas.microsoft.com/office/drawing/2016/5/12/chartex" xmlns:cx7="http://schemas.microsoft.com/office/drawing/2016/5/13/chartex" xmlns:cx8="http://schemas.microsoft.com/office/drawing/2016/5/14/chartex" xmlns:mc="http://schemas.openxmlformats.org/markup-compatibility/2006" xmlns:aink="http://schemas.microsoft.com/office/drawing/2016/ink" xmlns:am3d="http://schemas.microsoft.com/office/drawing/2017/model3d" xmlns:o="urn:schemas-microsoft-com:office:office" xmlns:r="http://schemas.openxmlformats.org/officeDocument/2006/relationships" xmlns:m="http://schemas.openxmlformats.org/officeDocument/2006/math" xmlns:v="urn:schemas-microsoft-com:vml" xmlns:wp14="http://schemas.microsoft.com/office/word/2010/wordprocessingDrawing" xmlns:wp="http://schemas.openxmlformats.org/drawingml/2006/wordprocessingDrawing" xmlns:w10="urn:schemas-microsoft-com:office:word" xmlns:w="http://schemas.openxmlformats.org/wordprocessingml/2006/main" xmlns:w14="http://schemas.microsoft.com/office/word/2010/wordml" xmlns:w15="http://schemas.microsoft.com/office/word/2012/wordml" xmlns:w16cex="http://schemas.microsoft.com/office/word/2018/wordml/cex" xmlns:w16cid="http://schemas.microsoft.com/office/word/2016/wordml/cid" xmlns:w16="http://schemas.microsoft.com/office/word/2018/wordml" xmlns:w16sdtdh="http://schemas.microsoft.com/office/word/2020/wordml/sdtdatahash" xmlns:w16se="http://schemas.microsoft.com/office/word/2015/wordml/symex" xmlns:wpg="http://schemas.microsoft.com/office/word/2010/wordprocessingGroup" xmlns:wpi="http://schemas.microsoft.com/office/word/2010/wordprocessingInk" xmlns:wne="http://schemas.microsoft.com/office/word/2006/wordml" xmlns:wps="http://schemas.microsoft.com/office/word/2010/wordprocessingShape" mc:Ignorable="w14 w15 w16se w16cid w16 w16cex w16sdtdh wp14">
+<w:document xmlns:wpc="http://schemas.microsoft.com/office/word/2010/wordprocessingCanvas" xmlns:cx="http://schemas.microsoft.com/office/drawing/2014/chartex" xmlns:cx1="http://schemas.microsoft.com/office/drawing/2015/9/8/chartex" xmlns:cx2="http://schemas.microsoft.com/office/drawing/2015/10/21/chartex" xmlns:cx3="http://schemas.microsoft.com/office/drawing/2016/5/9/chartex" xmlns:cx4="http://schemas.microsoft.com/office/drawing/2016/5/10/chartex" xmlns:cx5="http://schemas.microsoft.com/office/drawing/2016/5/11/chartex" xmlns:cx6="http://schemas.microsoft.com/office/drawing/2016/5/12/chartex" xmlns:cx7="http://schemas.microsoft.com/office/drawing/2016/5/13/chartex" xmlns:cx8="http://schemas.microsoft.com/office/drawing/2016/5/14/chartex" xmlns:mc="http://schemas.openxmlformats.org/markup-compatibility/2006" xmlns:aink="http://schemas.microsoft.com/office/drawing/2016/ink" xmlns:am3d="http://schemas.microsoft.com/office/drawing/2017/model3d" xmlns:o="urn:schemas-microsoft-com:office:office" xmlns:oel="http://schemas.microsoft.com/office/2019/extlst" xmlns:r="http://schemas.openxmlformats.org/officeDocument/2006/relationships" xmlns:m="http://schemas.openxmlformats.org/officeDocument/2006/math" xmlns:v="urn:schemas-microsoft-com:vml" xmlns:wp14="http://schemas.microsoft.com/office/word/2010/wordprocessingDrawing" xmlns:wp="http://schemas.openxmlformats.org/drawingml/2006/wordprocessingDrawing" xmlns:w10="urn:schemas-microsoft-com:office:word" xmlns:w="http://schemas.openxmlformats.org/wordprocessingml/2006/main" xmlns:w14="http://schemas.microsoft.com/office/word/2010/wordml" xmlns:w15="http://schemas.microsoft.com/office/word/2012/wordml" xmlns:w16cex="http://schemas.microsoft.com/office/word/2018/wordml/cex" xmlns:w16cid="http://schemas.microsoft.com/office/word/2016/wordml/cid" xmlns:w16="http://schemas.microsoft.com/office/word/2018/wordml" xmlns:w16sdtdh="http://schemas.microsoft.com/office/word/2020/wordml/sdtdatahash" xmlns:w16se="http://schemas.microsoft.com/office/word/2015/wordml/symex" xmlns:wpg="http://schemas.microsoft.com/office/word/2010/wordprocessingGroup" xmlns:wpi="http://schemas.microsoft.com/office/word/2010/wordprocessingInk" xmlns:wne="http://schemas.microsoft.com/office/word/2006/wordml" xmlns:wps="http://schemas.microsoft.com/office/word/2010/wordprocessingShape" mc:Ignorable="w14 w15 w16se w16cid w16 w16cex w16sdtdh wp14">
   <w:body>
-    <w:p>
-      <w:r>
-        <w:t xml:space="preserve">Notes of class components and other notes: </w:t>
-      </w:r>
-    </w:p>
-    <w:p/>
     <w:p>
       <w:pPr>
         <w:rPr>
@@ -24,6 +18,45 @@
           <w:sz w:val="40"/>
           <w:szCs w:val="40"/>
         </w:rPr>
+        <w:t xml:space="preserve">Notes of class components and other notes: </w:t>
+      </w:r>
+    </w:p>
+    <w:p/>
+    <w:p>
+      <w:pPr>
+        <w:rPr>
+          <w:b/>
+          <w:bCs/>
+          <w:sz w:val="80"/>
+          <w:szCs w:val="80"/>
+        </w:rPr>
+      </w:pPr>
+      <w:r>
+        <w:rPr>
+          <w:b/>
+          <w:bCs/>
+          <w:sz w:val="80"/>
+          <w:szCs w:val="80"/>
+        </w:rPr>
+        <w:t>Questions if any.</w:t>
+      </w:r>
+    </w:p>
+    <w:p>
+      <w:pPr>
+        <w:rPr>
+          <w:b/>
+          <w:bCs/>
+          <w:sz w:val="40"/>
+          <w:szCs w:val="40"/>
+        </w:rPr>
+      </w:pPr>
+      <w:r>
+        <w:rPr>
+          <w:b/>
+          <w:bCs/>
+          <w:sz w:val="40"/>
+          <w:szCs w:val="40"/>
+        </w:rPr>
         <w:t>When to use state?</w:t>
       </w:r>
     </w:p>
@@ -35,10 +68,1875 @@
         <w:t>dynamically</w:t>
       </w:r>
       <w:r>
-        <w:t xml:space="preserve"> without re-loade the page.</w:t>
+        <w:t xml:space="preserve"> without re-</w:t>
+      </w:r>
+      <w:proofErr w:type="spellStart"/>
+      <w:r>
+        <w:t>loade</w:t>
+      </w:r>
+      <w:proofErr w:type="spellEnd"/>
+      <w:r>
+        <w:t xml:space="preserve"> the page.</w:t>
       </w:r>
     </w:p>
     <w:p/>
+    <w:p>
+      <w:pPr>
+        <w:spacing w:before="100" w:beforeAutospacing="1" w:after="0" w:afterAutospacing="1" w:line="240" w:lineRule="auto"/>
+        <w:outlineLvl w:val="2"/>
+        <w:rPr>
+          <w:rFonts w:ascii="Consolas" w:eastAsia="Times New Roman" w:hAnsi="Consolas" w:cs="Courier New"/>
+          <w:color w:val="000000" w:themeColor="text1"/>
+          <w:sz w:val="20"/>
+          <w:szCs w:val="20"/>
+        </w:rPr>
+      </w:pPr>
+      <w:proofErr w:type="spellStart"/>
+      <w:r>
+        <w:rPr>
+          <w:rFonts w:ascii="Consolas" w:eastAsia="Times New Roman" w:hAnsi="Consolas" w:cs="Courier New"/>
+          <w:color w:val="000000" w:themeColor="text1"/>
+          <w:sz w:val="20"/>
+          <w:szCs w:val="20"/>
+        </w:rPr>
+        <w:t>rce</w:t>
+      </w:r>
+      <w:proofErr w:type="spellEnd"/>
+      <w:r>
+        <w:rPr>
+          <w:rFonts w:ascii="Consolas" w:eastAsia="Times New Roman" w:hAnsi="Consolas" w:cs="Courier New"/>
+          <w:color w:val="000000" w:themeColor="text1"/>
+          <w:sz w:val="20"/>
+          <w:szCs w:val="20"/>
+        </w:rPr>
+        <w:t xml:space="preserve"> : To add class bases </w:t>
+      </w:r>
+      <w:proofErr w:type="spellStart"/>
+      <w:r>
+        <w:rPr>
+          <w:rFonts w:ascii="Consolas" w:eastAsia="Times New Roman" w:hAnsi="Consolas" w:cs="Courier New"/>
+          <w:color w:val="000000" w:themeColor="text1"/>
+          <w:sz w:val="20"/>
+          <w:szCs w:val="20"/>
+        </w:rPr>
+        <w:t>componenet</w:t>
+      </w:r>
+      <w:proofErr w:type="spellEnd"/>
+      <w:r>
+        <w:rPr>
+          <w:rFonts w:ascii="Consolas" w:eastAsia="Times New Roman" w:hAnsi="Consolas" w:cs="Courier New"/>
+          <w:color w:val="000000" w:themeColor="text1"/>
+          <w:sz w:val="20"/>
+          <w:szCs w:val="20"/>
+        </w:rPr>
+        <w:t xml:space="preserve"> from the snippet.</w:t>
+      </w:r>
+    </w:p>
+    <w:p>
+      <w:pPr>
+        <w:spacing w:before="100" w:beforeAutospacing="1" w:after="0" w:afterAutospacing="1" w:line="240" w:lineRule="auto"/>
+        <w:outlineLvl w:val="2"/>
+        <w:rPr>
+          <w:rFonts w:ascii="Consolas" w:eastAsia="Times New Roman" w:hAnsi="Consolas" w:cs="Courier New"/>
+          <w:color w:val="000000" w:themeColor="text1"/>
+          <w:sz w:val="20"/>
+          <w:szCs w:val="20"/>
+        </w:rPr>
+      </w:pPr>
+      <w:r>
+        <w:rPr>
+          <w:rFonts w:ascii="Consolas" w:eastAsia="Times New Roman" w:hAnsi="Consolas" w:cs="Courier New"/>
+          <w:color w:val="000000" w:themeColor="text1"/>
+          <w:sz w:val="20"/>
+          <w:szCs w:val="20"/>
+        </w:rPr>
+        <w:t>===============================================================================</w:t>
+      </w:r>
+    </w:p>
+    <w:p>
+      <w:pPr>
+        <w:spacing w:before="100" w:beforeAutospacing="1" w:after="0" w:afterAutospacing="1" w:line="240" w:lineRule="auto"/>
+        <w:outlineLvl w:val="2"/>
+        <w:rPr>
+          <w:rFonts w:ascii="Consolas" w:eastAsia="Times New Roman" w:hAnsi="Consolas" w:cs="Courier New"/>
+          <w:b/>
+          <w:bCs/>
+          <w:color w:val="000000" w:themeColor="text1"/>
+          <w:sz w:val="80"/>
+          <w:szCs w:val="80"/>
+        </w:rPr>
+      </w:pPr>
+      <w:r>
+        <w:rPr>
+          <w:rFonts w:ascii="Consolas" w:eastAsia="Times New Roman" w:hAnsi="Consolas" w:cs="Courier New"/>
+          <w:b/>
+          <w:bCs/>
+          <w:color w:val="000000" w:themeColor="text1"/>
+          <w:sz w:val="80"/>
+          <w:szCs w:val="80"/>
+        </w:rPr>
+        <w:t>Tutorial : 26</w:t>
+      </w:r>
+    </w:p>
+    <w:p>
+      <w:pPr>
+        <w:spacing w:before="100" w:beforeAutospacing="1" w:after="0" w:afterAutospacing="1" w:line="240" w:lineRule="auto"/>
+        <w:outlineLvl w:val="2"/>
+        <w:rPr>
+          <w:rFonts w:ascii="Consolas" w:eastAsia="Times New Roman" w:hAnsi="Consolas" w:cs="Courier New"/>
+          <w:b/>
+          <w:bCs/>
+          <w:color w:val="000000" w:themeColor="text1"/>
+          <w:sz w:val="40"/>
+          <w:szCs w:val="40"/>
+        </w:rPr>
+      </w:pPr>
+      <w:r>
+        <w:rPr>
+          <w:rFonts w:ascii="Consolas" w:eastAsia="Times New Roman" w:hAnsi="Consolas" w:cs="Courier New"/>
+          <w:b/>
+          <w:bCs/>
+          <w:color w:val="000000" w:themeColor="text1"/>
+          <w:sz w:val="40"/>
+          <w:szCs w:val="40"/>
+        </w:rPr>
+        <w:t>Prop</w:t>
+      </w:r>
+      <w:r>
+        <w:rPr>
+          <w:rFonts w:ascii="Consolas" w:eastAsia="Times New Roman" w:hAnsi="Consolas" w:cs="Courier New"/>
+          <w:b/>
+          <w:bCs/>
+          <w:color w:val="000000" w:themeColor="text1"/>
+          <w:sz w:val="40"/>
+          <w:szCs w:val="40"/>
+        </w:rPr>
+        <w:t>es</w:t>
+      </w:r>
+      <w:r>
+        <w:rPr>
+          <w:rFonts w:ascii="Consolas" w:eastAsia="Times New Roman" w:hAnsi="Consolas" w:cs="Courier New"/>
+          <w:b/>
+          <w:bCs/>
+          <w:color w:val="000000" w:themeColor="text1"/>
+          <w:sz w:val="40"/>
+          <w:szCs w:val="40"/>
+        </w:rPr>
+        <w:t xml:space="preserve"> in </w:t>
+      </w:r>
+      <w:proofErr w:type="gramStart"/>
+      <w:r>
+        <w:rPr>
+          <w:rFonts w:ascii="Consolas" w:eastAsia="Times New Roman" w:hAnsi="Consolas" w:cs="Courier New"/>
+          <w:b/>
+          <w:bCs/>
+          <w:color w:val="000000" w:themeColor="text1"/>
+          <w:sz w:val="40"/>
+          <w:szCs w:val="40"/>
+        </w:rPr>
+        <w:t>class based</w:t>
+      </w:r>
+      <w:proofErr w:type="gramEnd"/>
+      <w:r>
+        <w:rPr>
+          <w:rFonts w:ascii="Consolas" w:eastAsia="Times New Roman" w:hAnsi="Consolas" w:cs="Courier New"/>
+          <w:b/>
+          <w:bCs/>
+          <w:color w:val="000000" w:themeColor="text1"/>
+          <w:sz w:val="40"/>
+          <w:szCs w:val="40"/>
+        </w:rPr>
+        <w:t xml:space="preserve"> component </w:t>
+      </w:r>
+    </w:p>
+    <w:p>
+      <w:pPr>
+        <w:shd w:val="clear" w:color="auto" w:fill="1E1E1E"/>
+        <w:spacing w:after="0" w:line="285" w:lineRule="atLeast"/>
+        <w:rPr>
+          <w:rFonts w:ascii="Consolas" w:eastAsia="Times New Roman" w:hAnsi="Consolas" w:cs="Times New Roman"/>
+          <w:color w:val="D4D4D4"/>
+          <w:sz w:val="21"/>
+          <w:szCs w:val="21"/>
+        </w:rPr>
+      </w:pPr>
+      <w:r>
+        <w:rPr>
+          <w:rFonts w:ascii="Consolas" w:eastAsia="Times New Roman" w:hAnsi="Consolas" w:cs="Times New Roman"/>
+          <w:color w:val="57A64A"/>
+          <w:sz w:val="21"/>
+          <w:szCs w:val="21"/>
+        </w:rPr>
+        <w:t xml:space="preserve">// we need to use props in </w:t>
+      </w:r>
+      <w:proofErr w:type="gramStart"/>
+      <w:r>
+        <w:rPr>
+          <w:rFonts w:ascii="Consolas" w:eastAsia="Times New Roman" w:hAnsi="Consolas" w:cs="Times New Roman"/>
+          <w:color w:val="57A64A"/>
+          <w:sz w:val="21"/>
+          <w:szCs w:val="21"/>
+        </w:rPr>
+        <w:t>class based</w:t>
+      </w:r>
+      <w:proofErr w:type="gramEnd"/>
+      <w:r>
+        <w:rPr>
+          <w:rFonts w:ascii="Consolas" w:eastAsia="Times New Roman" w:hAnsi="Consolas" w:cs="Times New Roman"/>
+          <w:color w:val="57A64A"/>
+          <w:sz w:val="21"/>
+          <w:szCs w:val="21"/>
+        </w:rPr>
+        <w:t xml:space="preserve"> components. </w:t>
+      </w:r>
+    </w:p>
+    <w:p>
+      <w:pPr>
+        <w:shd w:val="clear" w:color="auto" w:fill="1E1E1E"/>
+        <w:spacing w:after="0" w:line="285" w:lineRule="atLeast"/>
+        <w:rPr>
+          <w:rFonts w:ascii="Consolas" w:eastAsia="Times New Roman" w:hAnsi="Consolas" w:cs="Times New Roman"/>
+          <w:color w:val="D4D4D4"/>
+          <w:sz w:val="21"/>
+          <w:szCs w:val="21"/>
+        </w:rPr>
+      </w:pPr>
+      <w:r>
+        <w:rPr>
+          <w:rFonts w:ascii="Consolas" w:eastAsia="Times New Roman" w:hAnsi="Consolas" w:cs="Times New Roman"/>
+          <w:color w:val="D4D4D4"/>
+          <w:sz w:val="21"/>
+          <w:szCs w:val="21"/>
+        </w:rPr>
+        <w:t xml:space="preserve">    </w:t>
+      </w:r>
+      <w:r>
+        <w:rPr>
+          <w:rFonts w:ascii="Consolas" w:eastAsia="Times New Roman" w:hAnsi="Consolas" w:cs="Times New Roman"/>
+          <w:color w:val="569CD6"/>
+          <w:sz w:val="21"/>
+          <w:szCs w:val="21"/>
+        </w:rPr>
+        <w:t>let</w:t>
+      </w:r>
+      <w:r>
+        <w:rPr>
+          <w:rFonts w:ascii="Consolas" w:eastAsia="Times New Roman" w:hAnsi="Consolas" w:cs="Times New Roman"/>
+          <w:color w:val="D4D4D4"/>
+          <w:sz w:val="21"/>
+          <w:szCs w:val="21"/>
+        </w:rPr>
+        <w:t xml:space="preserve"> {</w:t>
+      </w:r>
+      <w:r>
+        <w:rPr>
+          <w:rFonts w:ascii="Consolas" w:eastAsia="Times New Roman" w:hAnsi="Consolas" w:cs="Times New Roman"/>
+          <w:color w:val="C8C8C8"/>
+          <w:sz w:val="21"/>
+          <w:szCs w:val="21"/>
+        </w:rPr>
+        <w:t>title</w:t>
+      </w:r>
+      <w:r>
+        <w:rPr>
+          <w:rFonts w:ascii="Consolas" w:eastAsia="Times New Roman" w:hAnsi="Consolas" w:cs="Times New Roman"/>
+          <w:color w:val="D4D4D4"/>
+          <w:sz w:val="21"/>
+          <w:szCs w:val="21"/>
+        </w:rPr>
+        <w:t xml:space="preserve">, </w:t>
+      </w:r>
+      <w:r>
+        <w:rPr>
+          <w:rFonts w:ascii="Consolas" w:eastAsia="Times New Roman" w:hAnsi="Consolas" w:cs="Times New Roman"/>
+          <w:color w:val="C8C8C8"/>
+          <w:sz w:val="21"/>
+          <w:szCs w:val="21"/>
+        </w:rPr>
+        <w:t>description</w:t>
+      </w:r>
+      <w:r>
+        <w:rPr>
+          <w:rFonts w:ascii="Consolas" w:eastAsia="Times New Roman" w:hAnsi="Consolas" w:cs="Times New Roman"/>
+          <w:color w:val="D4D4D4"/>
+          <w:sz w:val="21"/>
+          <w:szCs w:val="21"/>
+        </w:rPr>
+        <w:t xml:space="preserve">, </w:t>
+      </w:r>
+      <w:proofErr w:type="spellStart"/>
+      <w:r>
+        <w:rPr>
+          <w:rFonts w:ascii="Consolas" w:eastAsia="Times New Roman" w:hAnsi="Consolas" w:cs="Times New Roman"/>
+          <w:color w:val="C8C8C8"/>
+          <w:sz w:val="21"/>
+          <w:szCs w:val="21"/>
+        </w:rPr>
+        <w:t>imageUrl</w:t>
+      </w:r>
+      <w:proofErr w:type="spellEnd"/>
+      <w:r>
+        <w:rPr>
+          <w:rFonts w:ascii="Consolas" w:eastAsia="Times New Roman" w:hAnsi="Consolas" w:cs="Times New Roman"/>
+          <w:color w:val="D4D4D4"/>
+          <w:sz w:val="21"/>
+          <w:szCs w:val="21"/>
+        </w:rPr>
+        <w:t xml:space="preserve">, </w:t>
+      </w:r>
+      <w:proofErr w:type="spellStart"/>
+      <w:r>
+        <w:rPr>
+          <w:rFonts w:ascii="Consolas" w:eastAsia="Times New Roman" w:hAnsi="Consolas" w:cs="Times New Roman"/>
+          <w:color w:val="C8C8C8"/>
+          <w:sz w:val="21"/>
+          <w:szCs w:val="21"/>
+        </w:rPr>
+        <w:t>newsUrl</w:t>
+      </w:r>
+      <w:proofErr w:type="spellEnd"/>
+      <w:r>
+        <w:rPr>
+          <w:rFonts w:ascii="Consolas" w:eastAsia="Times New Roman" w:hAnsi="Consolas" w:cs="Times New Roman"/>
+          <w:color w:val="D4D4D4"/>
+          <w:sz w:val="21"/>
+          <w:szCs w:val="21"/>
+        </w:rPr>
+        <w:t xml:space="preserve">} </w:t>
+      </w:r>
+      <w:r>
+        <w:rPr>
+          <w:rFonts w:ascii="Consolas" w:eastAsia="Times New Roman" w:hAnsi="Consolas" w:cs="Times New Roman"/>
+          <w:color w:val="B4B4B4"/>
+          <w:sz w:val="21"/>
+          <w:szCs w:val="21"/>
+        </w:rPr>
+        <w:t>=</w:t>
+      </w:r>
+      <w:r>
+        <w:rPr>
+          <w:rFonts w:ascii="Consolas" w:eastAsia="Times New Roman" w:hAnsi="Consolas" w:cs="Times New Roman"/>
+          <w:color w:val="D4D4D4"/>
+          <w:sz w:val="21"/>
+          <w:szCs w:val="21"/>
+        </w:rPr>
+        <w:t xml:space="preserve"> </w:t>
+      </w:r>
+      <w:proofErr w:type="spellStart"/>
+      <w:r>
+        <w:rPr>
+          <w:rFonts w:ascii="Consolas" w:eastAsia="Times New Roman" w:hAnsi="Consolas" w:cs="Times New Roman"/>
+          <w:color w:val="569CD6"/>
+          <w:sz w:val="21"/>
+          <w:szCs w:val="21"/>
+        </w:rPr>
+        <w:t>this</w:t>
+      </w:r>
+      <w:r>
+        <w:rPr>
+          <w:rFonts w:ascii="Consolas" w:eastAsia="Times New Roman" w:hAnsi="Consolas" w:cs="Times New Roman"/>
+          <w:color w:val="D4D4D4"/>
+          <w:sz w:val="21"/>
+          <w:szCs w:val="21"/>
+        </w:rPr>
+        <w:t>.</w:t>
+      </w:r>
+      <w:r>
+        <w:rPr>
+          <w:rFonts w:ascii="Consolas" w:eastAsia="Times New Roman" w:hAnsi="Consolas" w:cs="Times New Roman"/>
+          <w:color w:val="DADADA"/>
+          <w:sz w:val="21"/>
+          <w:szCs w:val="21"/>
+        </w:rPr>
+        <w:t>props</w:t>
+      </w:r>
+      <w:proofErr w:type="spellEnd"/>
+      <w:r>
+        <w:rPr>
+          <w:rFonts w:ascii="Consolas" w:eastAsia="Times New Roman" w:hAnsi="Consolas" w:cs="Times New Roman"/>
+          <w:color w:val="D4D4D4"/>
+          <w:sz w:val="21"/>
+          <w:szCs w:val="21"/>
+        </w:rPr>
+        <w:t>;</w:t>
+      </w:r>
+    </w:p>
+    <w:p>
+      <w:pPr>
+        <w:spacing w:before="100" w:beforeAutospacing="1" w:after="0" w:afterAutospacing="1" w:line="240" w:lineRule="auto"/>
+        <w:outlineLvl w:val="2"/>
+        <w:rPr>
+          <w:rFonts w:ascii="Consolas" w:eastAsia="Times New Roman" w:hAnsi="Consolas" w:cs="Courier New"/>
+          <w:color w:val="000000" w:themeColor="text1"/>
+          <w:sz w:val="30"/>
+          <w:szCs w:val="30"/>
+        </w:rPr>
+      </w:pPr>
+      <w:r>
+        <w:rPr>
+          <w:rFonts w:ascii="Consolas" w:eastAsia="Times New Roman" w:hAnsi="Consolas" w:cs="Courier New"/>
+          <w:color w:val="000000" w:themeColor="text1"/>
+          <w:sz w:val="30"/>
+          <w:szCs w:val="30"/>
+        </w:rPr>
+        <w:t>this is how we can use props which are sent from another file.</w:t>
+      </w:r>
+      <w:r>
+        <w:rPr>
+          <w:rFonts w:ascii="Consolas" w:eastAsia="Times New Roman" w:hAnsi="Consolas" w:cs="Courier New"/>
+          <w:color w:val="000000" w:themeColor="text1"/>
+          <w:sz w:val="30"/>
+          <w:szCs w:val="30"/>
+        </w:rPr>
+        <w:t xml:space="preserve"> This is newsitems.js file which got the props from News.js</w:t>
+      </w:r>
+      <w:r>
+        <w:rPr>
+          <w:rFonts w:ascii="Consolas" w:eastAsia="Times New Roman" w:hAnsi="Consolas" w:cs="Courier New"/>
+          <w:color w:val="000000" w:themeColor="text1"/>
+          <w:sz w:val="30"/>
+          <w:szCs w:val="30"/>
+        </w:rPr>
+        <w:t>.</w:t>
+      </w:r>
+    </w:p>
+    <w:p>
+      <w:pPr>
+        <w:spacing w:before="100" w:beforeAutospacing="1" w:after="0" w:afterAutospacing="1" w:line="240" w:lineRule="auto"/>
+        <w:outlineLvl w:val="2"/>
+        <w:rPr>
+          <w:rFonts w:ascii="Consolas" w:eastAsia="Times New Roman" w:hAnsi="Consolas" w:cs="Courier New"/>
+          <w:color w:val="000000" w:themeColor="text1"/>
+          <w:sz w:val="30"/>
+          <w:szCs w:val="30"/>
+        </w:rPr>
+      </w:pPr>
+    </w:p>
+    <w:p>
+      <w:pPr>
+        <w:spacing w:before="100" w:beforeAutospacing="1" w:after="0" w:afterAutospacing="1" w:line="240" w:lineRule="auto"/>
+        <w:outlineLvl w:val="2"/>
+        <w:rPr>
+          <w:rFonts w:ascii="Consolas" w:eastAsia="Times New Roman" w:hAnsi="Consolas" w:cs="Courier New"/>
+          <w:color w:val="000000" w:themeColor="text1"/>
+          <w:sz w:val="30"/>
+          <w:szCs w:val="30"/>
+        </w:rPr>
+      </w:pPr>
+      <w:r>
+        <w:rPr>
+          <w:rFonts w:ascii="Consolas" w:eastAsia="Times New Roman" w:hAnsi="Consolas" w:cs="Courier New"/>
+          <w:color w:val="000000" w:themeColor="text1"/>
+          <w:sz w:val="30"/>
+          <w:szCs w:val="30"/>
+        </w:rPr>
+        <w:t xml:space="preserve">How can we use </w:t>
+      </w:r>
+      <w:proofErr w:type="gramStart"/>
+      <w:r>
+        <w:rPr>
+          <w:rFonts w:ascii="Consolas" w:eastAsia="Times New Roman" w:hAnsi="Consolas" w:cs="Courier New"/>
+          <w:color w:val="000000" w:themeColor="text1"/>
+          <w:sz w:val="30"/>
+          <w:szCs w:val="30"/>
+        </w:rPr>
+        <w:t>props.</w:t>
+      </w:r>
+      <w:proofErr w:type="gramEnd"/>
+    </w:p>
+    <w:p>
+      <w:pPr>
+        <w:shd w:val="clear" w:color="auto" w:fill="1E1E1E"/>
+        <w:spacing w:after="0" w:line="285" w:lineRule="atLeast"/>
+        <w:rPr>
+          <w:rFonts w:ascii="Consolas" w:eastAsia="Times New Roman" w:hAnsi="Consolas" w:cs="Times New Roman"/>
+          <w:color w:val="D4D4D4"/>
+          <w:sz w:val="21"/>
+          <w:szCs w:val="21"/>
+        </w:rPr>
+      </w:pPr>
+      <w:r>
+        <w:rPr>
+          <w:rFonts w:ascii="Consolas" w:eastAsia="Times New Roman" w:hAnsi="Consolas" w:cs="Times New Roman"/>
+          <w:color w:val="808080"/>
+          <w:sz w:val="21"/>
+          <w:szCs w:val="21"/>
+        </w:rPr>
+        <w:t>&lt;</w:t>
+      </w:r>
+      <w:r>
+        <w:rPr>
+          <w:rFonts w:ascii="Consolas" w:eastAsia="Times New Roman" w:hAnsi="Consolas" w:cs="Times New Roman"/>
+          <w:color w:val="569CD6"/>
+          <w:sz w:val="21"/>
+          <w:szCs w:val="21"/>
+        </w:rPr>
+        <w:t>h5</w:t>
+      </w:r>
+      <w:r>
+        <w:rPr>
+          <w:rFonts w:ascii="Consolas" w:eastAsia="Times New Roman" w:hAnsi="Consolas" w:cs="Times New Roman"/>
+          <w:color w:val="D4D4D4"/>
+          <w:sz w:val="21"/>
+          <w:szCs w:val="21"/>
+        </w:rPr>
+        <w:t xml:space="preserve"> </w:t>
+      </w:r>
+      <w:proofErr w:type="spellStart"/>
+      <w:r>
+        <w:rPr>
+          <w:rFonts w:ascii="Consolas" w:eastAsia="Times New Roman" w:hAnsi="Consolas" w:cs="Times New Roman"/>
+          <w:color w:val="9CDCFE"/>
+          <w:sz w:val="21"/>
+          <w:szCs w:val="21"/>
+        </w:rPr>
+        <w:t>className</w:t>
+      </w:r>
+      <w:proofErr w:type="spellEnd"/>
+      <w:r>
+        <w:rPr>
+          <w:rFonts w:ascii="Consolas" w:eastAsia="Times New Roman" w:hAnsi="Consolas" w:cs="Times New Roman"/>
+          <w:color w:val="B4B4B4"/>
+          <w:sz w:val="21"/>
+          <w:szCs w:val="21"/>
+        </w:rPr>
+        <w:t>=</w:t>
+      </w:r>
+      <w:r>
+        <w:rPr>
+          <w:rFonts w:ascii="Consolas" w:eastAsia="Times New Roman" w:hAnsi="Consolas" w:cs="Times New Roman"/>
+          <w:color w:val="D69D85"/>
+          <w:sz w:val="21"/>
+          <w:szCs w:val="21"/>
+        </w:rPr>
+        <w:t>"card-title"</w:t>
+      </w:r>
+      <w:r>
+        <w:rPr>
+          <w:rFonts w:ascii="Consolas" w:eastAsia="Times New Roman" w:hAnsi="Consolas" w:cs="Times New Roman"/>
+          <w:color w:val="808080"/>
+          <w:sz w:val="21"/>
+          <w:szCs w:val="21"/>
+        </w:rPr>
+        <w:t>&gt;</w:t>
+      </w:r>
+      <w:r>
+        <w:rPr>
+          <w:rFonts w:ascii="Consolas" w:eastAsia="Times New Roman" w:hAnsi="Consolas" w:cs="Times New Roman"/>
+          <w:color w:val="569CD6"/>
+          <w:sz w:val="21"/>
+          <w:szCs w:val="21"/>
+        </w:rPr>
+        <w:t>{</w:t>
+      </w:r>
+      <w:r>
+        <w:rPr>
+          <w:rFonts w:ascii="Consolas" w:eastAsia="Times New Roman" w:hAnsi="Consolas" w:cs="Times New Roman"/>
+          <w:color w:val="C8C8C8"/>
+          <w:sz w:val="21"/>
+          <w:szCs w:val="21"/>
+        </w:rPr>
+        <w:t>title</w:t>
+      </w:r>
+      <w:r>
+        <w:rPr>
+          <w:rFonts w:ascii="Consolas" w:eastAsia="Times New Roman" w:hAnsi="Consolas" w:cs="Times New Roman"/>
+          <w:color w:val="569CD6"/>
+          <w:sz w:val="21"/>
+          <w:szCs w:val="21"/>
+        </w:rPr>
+        <w:t>}</w:t>
+      </w:r>
+      <w:r>
+        <w:rPr>
+          <w:rFonts w:ascii="Consolas" w:eastAsia="Times New Roman" w:hAnsi="Consolas" w:cs="Times New Roman"/>
+          <w:color w:val="808080"/>
+          <w:sz w:val="21"/>
+          <w:szCs w:val="21"/>
+        </w:rPr>
+        <w:t>&lt;/</w:t>
+      </w:r>
+      <w:r>
+        <w:rPr>
+          <w:rFonts w:ascii="Consolas" w:eastAsia="Times New Roman" w:hAnsi="Consolas" w:cs="Times New Roman"/>
+          <w:color w:val="569CD6"/>
+          <w:sz w:val="21"/>
+          <w:szCs w:val="21"/>
+        </w:rPr>
+        <w:t>h5</w:t>
+      </w:r>
+      <w:r>
+        <w:rPr>
+          <w:rFonts w:ascii="Consolas" w:eastAsia="Times New Roman" w:hAnsi="Consolas" w:cs="Times New Roman"/>
+          <w:color w:val="808080"/>
+          <w:sz w:val="21"/>
+          <w:szCs w:val="21"/>
+        </w:rPr>
+        <w:t>&gt;</w:t>
+      </w:r>
+    </w:p>
+    <w:p>
+      <w:pPr>
+        <w:shd w:val="clear" w:color="auto" w:fill="1E1E1E"/>
+        <w:spacing w:after="0" w:line="285" w:lineRule="atLeast"/>
+        <w:rPr>
+          <w:rFonts w:ascii="Consolas" w:eastAsia="Times New Roman" w:hAnsi="Consolas" w:cs="Times New Roman"/>
+          <w:color w:val="D4D4D4"/>
+          <w:sz w:val="21"/>
+          <w:szCs w:val="21"/>
+        </w:rPr>
+      </w:pPr>
+      <w:r>
+        <w:rPr>
+          <w:rFonts w:ascii="Consolas" w:eastAsia="Times New Roman" w:hAnsi="Consolas" w:cs="Times New Roman"/>
+          <w:color w:val="808080"/>
+          <w:sz w:val="21"/>
+          <w:szCs w:val="21"/>
+        </w:rPr>
+        <w:t>&lt;</w:t>
+      </w:r>
+      <w:r>
+        <w:rPr>
+          <w:rFonts w:ascii="Consolas" w:eastAsia="Times New Roman" w:hAnsi="Consolas" w:cs="Times New Roman"/>
+          <w:color w:val="569CD6"/>
+          <w:sz w:val="21"/>
+          <w:szCs w:val="21"/>
+        </w:rPr>
+        <w:t>p</w:t>
+      </w:r>
+      <w:r>
+        <w:rPr>
+          <w:rFonts w:ascii="Consolas" w:eastAsia="Times New Roman" w:hAnsi="Consolas" w:cs="Times New Roman"/>
+          <w:color w:val="D4D4D4"/>
+          <w:sz w:val="21"/>
+          <w:szCs w:val="21"/>
+        </w:rPr>
+        <w:t xml:space="preserve"> </w:t>
+      </w:r>
+      <w:proofErr w:type="spellStart"/>
+      <w:r>
+        <w:rPr>
+          <w:rFonts w:ascii="Consolas" w:eastAsia="Times New Roman" w:hAnsi="Consolas" w:cs="Times New Roman"/>
+          <w:color w:val="9CDCFE"/>
+          <w:sz w:val="21"/>
+          <w:szCs w:val="21"/>
+        </w:rPr>
+        <w:t>className</w:t>
+      </w:r>
+      <w:proofErr w:type="spellEnd"/>
+      <w:r>
+        <w:rPr>
+          <w:rFonts w:ascii="Consolas" w:eastAsia="Times New Roman" w:hAnsi="Consolas" w:cs="Times New Roman"/>
+          <w:color w:val="B4B4B4"/>
+          <w:sz w:val="21"/>
+          <w:szCs w:val="21"/>
+        </w:rPr>
+        <w:t>=</w:t>
+      </w:r>
+      <w:r>
+        <w:rPr>
+          <w:rFonts w:ascii="Consolas" w:eastAsia="Times New Roman" w:hAnsi="Consolas" w:cs="Times New Roman"/>
+          <w:color w:val="D69D85"/>
+          <w:sz w:val="21"/>
+          <w:szCs w:val="21"/>
+        </w:rPr>
+        <w:t>"card-text"</w:t>
+      </w:r>
+      <w:r>
+        <w:rPr>
+          <w:rFonts w:ascii="Consolas" w:eastAsia="Times New Roman" w:hAnsi="Consolas" w:cs="Times New Roman"/>
+          <w:color w:val="808080"/>
+          <w:sz w:val="21"/>
+          <w:szCs w:val="21"/>
+        </w:rPr>
+        <w:t>&gt;</w:t>
+      </w:r>
+      <w:r>
+        <w:rPr>
+          <w:rFonts w:ascii="Consolas" w:eastAsia="Times New Roman" w:hAnsi="Consolas" w:cs="Times New Roman"/>
+          <w:color w:val="569CD6"/>
+          <w:sz w:val="21"/>
+          <w:szCs w:val="21"/>
+        </w:rPr>
+        <w:t>{</w:t>
+      </w:r>
+      <w:r>
+        <w:rPr>
+          <w:rFonts w:ascii="Consolas" w:eastAsia="Times New Roman" w:hAnsi="Consolas" w:cs="Times New Roman"/>
+          <w:color w:val="C8C8C8"/>
+          <w:sz w:val="21"/>
+          <w:szCs w:val="21"/>
+        </w:rPr>
+        <w:t>description</w:t>
+      </w:r>
+      <w:r>
+        <w:rPr>
+          <w:rFonts w:ascii="Consolas" w:eastAsia="Times New Roman" w:hAnsi="Consolas" w:cs="Times New Roman"/>
+          <w:color w:val="569CD6"/>
+          <w:sz w:val="21"/>
+          <w:szCs w:val="21"/>
+        </w:rPr>
+        <w:t>}</w:t>
+      </w:r>
+      <w:r>
+        <w:rPr>
+          <w:rFonts w:ascii="Consolas" w:eastAsia="Times New Roman" w:hAnsi="Consolas" w:cs="Times New Roman"/>
+          <w:color w:val="808080"/>
+          <w:sz w:val="21"/>
+          <w:szCs w:val="21"/>
+        </w:rPr>
+        <w:t>&lt;/</w:t>
+      </w:r>
+      <w:r>
+        <w:rPr>
+          <w:rFonts w:ascii="Consolas" w:eastAsia="Times New Roman" w:hAnsi="Consolas" w:cs="Times New Roman"/>
+          <w:color w:val="569CD6"/>
+          <w:sz w:val="21"/>
+          <w:szCs w:val="21"/>
+        </w:rPr>
+        <w:t>p</w:t>
+      </w:r>
+      <w:r>
+        <w:rPr>
+          <w:rFonts w:ascii="Consolas" w:eastAsia="Times New Roman" w:hAnsi="Consolas" w:cs="Times New Roman"/>
+          <w:color w:val="808080"/>
+          <w:sz w:val="21"/>
+          <w:szCs w:val="21"/>
+        </w:rPr>
+        <w:t>&gt;</w:t>
+      </w:r>
+    </w:p>
+    <w:p>
+      <w:pPr>
+        <w:spacing w:before="100" w:beforeAutospacing="1" w:after="0" w:afterAutospacing="1" w:line="240" w:lineRule="auto"/>
+        <w:outlineLvl w:val="2"/>
+        <w:rPr>
+          <w:rFonts w:ascii="Consolas" w:eastAsia="Times New Roman" w:hAnsi="Consolas" w:cs="Courier New"/>
+          <w:color w:val="000000" w:themeColor="text1"/>
+          <w:sz w:val="30"/>
+          <w:szCs w:val="30"/>
+        </w:rPr>
+      </w:pPr>
+    </w:p>
+    <w:p>
+      <w:pPr>
+        <w:spacing w:before="100" w:beforeAutospacing="1" w:after="0" w:afterAutospacing="1" w:line="240" w:lineRule="auto"/>
+        <w:outlineLvl w:val="2"/>
+        <w:rPr>
+          <w:rFonts w:ascii="Consolas" w:eastAsia="Times New Roman" w:hAnsi="Consolas" w:cs="Courier New"/>
+          <w:color w:val="000000" w:themeColor="text1"/>
+          <w:sz w:val="30"/>
+          <w:szCs w:val="30"/>
+        </w:rPr>
+      </w:pPr>
+      <w:r>
+        <w:rPr>
+          <w:rFonts w:ascii="Consolas" w:eastAsia="Times New Roman" w:hAnsi="Consolas" w:cs="Courier New"/>
+          <w:color w:val="000000" w:themeColor="text1"/>
+          <w:sz w:val="30"/>
+          <w:szCs w:val="30"/>
+        </w:rPr>
+        <w:t>========================================================</w:t>
+      </w:r>
+    </w:p>
+    <w:p>
+      <w:pPr>
+        <w:spacing w:before="100" w:beforeAutospacing="1" w:after="0" w:afterAutospacing="1" w:line="240" w:lineRule="auto"/>
+        <w:outlineLvl w:val="2"/>
+        <w:rPr>
+          <w:rFonts w:ascii="Consolas" w:eastAsia="Times New Roman" w:hAnsi="Consolas" w:cs="Courier New"/>
+          <w:b/>
+          <w:bCs/>
+          <w:color w:val="000000" w:themeColor="text1"/>
+          <w:sz w:val="40"/>
+          <w:szCs w:val="40"/>
+        </w:rPr>
+      </w:pPr>
+      <w:r>
+        <w:rPr>
+          <w:rFonts w:ascii="Consolas" w:eastAsia="Times New Roman" w:hAnsi="Consolas" w:cs="Courier New"/>
+          <w:b/>
+          <w:bCs/>
+          <w:color w:val="000000" w:themeColor="text1"/>
+          <w:sz w:val="40"/>
+          <w:szCs w:val="40"/>
+        </w:rPr>
+        <w:lastRenderedPageBreak/>
+        <w:t xml:space="preserve">State in </w:t>
+      </w:r>
+      <w:proofErr w:type="gramStart"/>
+      <w:r>
+        <w:rPr>
+          <w:rFonts w:ascii="Consolas" w:eastAsia="Times New Roman" w:hAnsi="Consolas" w:cs="Courier New"/>
+          <w:b/>
+          <w:bCs/>
+          <w:color w:val="000000" w:themeColor="text1"/>
+          <w:sz w:val="40"/>
+          <w:szCs w:val="40"/>
+        </w:rPr>
+        <w:t>class based</w:t>
+      </w:r>
+      <w:proofErr w:type="gramEnd"/>
+      <w:r>
+        <w:rPr>
+          <w:rFonts w:ascii="Consolas" w:eastAsia="Times New Roman" w:hAnsi="Consolas" w:cs="Courier New"/>
+          <w:b/>
+          <w:bCs/>
+          <w:color w:val="000000" w:themeColor="text1"/>
+          <w:sz w:val="40"/>
+          <w:szCs w:val="40"/>
+        </w:rPr>
+        <w:t xml:space="preserve"> components</w:t>
+      </w:r>
+    </w:p>
+    <w:p>
+      <w:pPr>
+        <w:shd w:val="clear" w:color="auto" w:fill="1E1E1E"/>
+        <w:spacing w:after="0" w:line="285" w:lineRule="atLeast"/>
+        <w:rPr>
+          <w:rFonts w:ascii="Consolas" w:eastAsia="Times New Roman" w:hAnsi="Consolas" w:cs="Times New Roman"/>
+          <w:color w:val="D4D4D4"/>
+          <w:sz w:val="21"/>
+          <w:szCs w:val="21"/>
+        </w:rPr>
+      </w:pPr>
+      <w:proofErr w:type="spellStart"/>
+      <w:r>
+        <w:rPr>
+          <w:rFonts w:ascii="Consolas" w:eastAsia="Times New Roman" w:hAnsi="Consolas" w:cs="Times New Roman"/>
+          <w:color w:val="569CD6"/>
+          <w:sz w:val="21"/>
+          <w:szCs w:val="21"/>
+        </w:rPr>
+        <w:t>this</w:t>
+      </w:r>
+      <w:r>
+        <w:rPr>
+          <w:rFonts w:ascii="Consolas" w:eastAsia="Times New Roman" w:hAnsi="Consolas" w:cs="Times New Roman"/>
+          <w:color w:val="D4D4D4"/>
+          <w:sz w:val="21"/>
+          <w:szCs w:val="21"/>
+        </w:rPr>
+        <w:t>.</w:t>
+      </w:r>
+      <w:r>
+        <w:rPr>
+          <w:rFonts w:ascii="Consolas" w:eastAsia="Times New Roman" w:hAnsi="Consolas" w:cs="Times New Roman"/>
+          <w:color w:val="DADADA"/>
+          <w:sz w:val="21"/>
+          <w:szCs w:val="21"/>
+        </w:rPr>
+        <w:t>state</w:t>
+      </w:r>
+      <w:proofErr w:type="spellEnd"/>
+      <w:r>
+        <w:rPr>
+          <w:rFonts w:ascii="Consolas" w:eastAsia="Times New Roman" w:hAnsi="Consolas" w:cs="Times New Roman"/>
+          <w:color w:val="D4D4D4"/>
+          <w:sz w:val="21"/>
+          <w:szCs w:val="21"/>
+        </w:rPr>
+        <w:t xml:space="preserve"> </w:t>
+      </w:r>
+      <w:r>
+        <w:rPr>
+          <w:rFonts w:ascii="Consolas" w:eastAsia="Times New Roman" w:hAnsi="Consolas" w:cs="Times New Roman"/>
+          <w:color w:val="B4B4B4"/>
+          <w:sz w:val="21"/>
+          <w:szCs w:val="21"/>
+        </w:rPr>
+        <w:t>=</w:t>
+      </w:r>
+      <w:r>
+        <w:rPr>
+          <w:rFonts w:ascii="Consolas" w:eastAsia="Times New Roman" w:hAnsi="Consolas" w:cs="Times New Roman"/>
+          <w:color w:val="D4D4D4"/>
+          <w:sz w:val="21"/>
+          <w:szCs w:val="21"/>
+        </w:rPr>
+        <w:t xml:space="preserve"> {</w:t>
+      </w:r>
+    </w:p>
+    <w:p>
+      <w:pPr>
+        <w:shd w:val="clear" w:color="auto" w:fill="1E1E1E"/>
+        <w:spacing w:after="0" w:line="285" w:lineRule="atLeast"/>
+        <w:rPr>
+          <w:rFonts w:ascii="Consolas" w:eastAsia="Times New Roman" w:hAnsi="Consolas" w:cs="Times New Roman"/>
+          <w:color w:val="D4D4D4"/>
+          <w:sz w:val="21"/>
+          <w:szCs w:val="21"/>
+        </w:rPr>
+      </w:pPr>
+      <w:r>
+        <w:rPr>
+          <w:rFonts w:ascii="Consolas" w:eastAsia="Times New Roman" w:hAnsi="Consolas" w:cs="Times New Roman"/>
+          <w:color w:val="D4D4D4"/>
+          <w:sz w:val="21"/>
+          <w:szCs w:val="21"/>
+        </w:rPr>
+        <w:t xml:space="preserve">        articles: </w:t>
+      </w:r>
+      <w:proofErr w:type="spellStart"/>
+      <w:r>
+        <w:rPr>
+          <w:rFonts w:ascii="Consolas" w:eastAsia="Times New Roman" w:hAnsi="Consolas" w:cs="Times New Roman"/>
+          <w:color w:val="569CD6"/>
+          <w:sz w:val="21"/>
+          <w:szCs w:val="21"/>
+        </w:rPr>
+        <w:t>this</w:t>
+      </w:r>
+      <w:r>
+        <w:rPr>
+          <w:rFonts w:ascii="Consolas" w:eastAsia="Times New Roman" w:hAnsi="Consolas" w:cs="Times New Roman"/>
+          <w:color w:val="D4D4D4"/>
+          <w:sz w:val="21"/>
+          <w:szCs w:val="21"/>
+        </w:rPr>
+        <w:t>.</w:t>
+      </w:r>
+      <w:r>
+        <w:rPr>
+          <w:rFonts w:ascii="Consolas" w:eastAsia="Times New Roman" w:hAnsi="Consolas" w:cs="Times New Roman"/>
+          <w:color w:val="DADADA"/>
+          <w:sz w:val="21"/>
+          <w:szCs w:val="21"/>
+        </w:rPr>
+        <w:t>articles</w:t>
+      </w:r>
+      <w:proofErr w:type="spellEnd"/>
+      <w:r>
+        <w:rPr>
+          <w:rFonts w:ascii="Consolas" w:eastAsia="Times New Roman" w:hAnsi="Consolas" w:cs="Times New Roman"/>
+          <w:color w:val="D4D4D4"/>
+          <w:sz w:val="21"/>
+          <w:szCs w:val="21"/>
+        </w:rPr>
+        <w:t>,</w:t>
+      </w:r>
+    </w:p>
+    <w:p>
+      <w:pPr>
+        <w:shd w:val="clear" w:color="auto" w:fill="1E1E1E"/>
+        <w:spacing w:after="0" w:line="285" w:lineRule="atLeast"/>
+        <w:rPr>
+          <w:rFonts w:ascii="Consolas" w:eastAsia="Times New Roman" w:hAnsi="Consolas" w:cs="Times New Roman"/>
+          <w:color w:val="D4D4D4"/>
+          <w:sz w:val="21"/>
+          <w:szCs w:val="21"/>
+        </w:rPr>
+      </w:pPr>
+      <w:r>
+        <w:rPr>
+          <w:rFonts w:ascii="Consolas" w:eastAsia="Times New Roman" w:hAnsi="Consolas" w:cs="Times New Roman"/>
+          <w:color w:val="D4D4D4"/>
+          <w:sz w:val="21"/>
+          <w:szCs w:val="21"/>
+        </w:rPr>
+        <w:t xml:space="preserve">        loading: </w:t>
+      </w:r>
+      <w:r>
+        <w:rPr>
+          <w:rFonts w:ascii="Consolas" w:eastAsia="Times New Roman" w:hAnsi="Consolas" w:cs="Times New Roman"/>
+          <w:color w:val="569CD6"/>
+          <w:sz w:val="21"/>
+          <w:szCs w:val="21"/>
+        </w:rPr>
+        <w:t>false</w:t>
+      </w:r>
+    </w:p>
+    <w:p>
+      <w:pPr>
+        <w:shd w:val="clear" w:color="auto" w:fill="1E1E1E"/>
+        <w:spacing w:after="0" w:line="285" w:lineRule="atLeast"/>
+        <w:rPr>
+          <w:rFonts w:ascii="Consolas" w:eastAsia="Times New Roman" w:hAnsi="Consolas" w:cs="Times New Roman"/>
+          <w:color w:val="D4D4D4"/>
+          <w:sz w:val="21"/>
+          <w:szCs w:val="21"/>
+        </w:rPr>
+      </w:pPr>
+      <w:r>
+        <w:rPr>
+          <w:rFonts w:ascii="Consolas" w:eastAsia="Times New Roman" w:hAnsi="Consolas" w:cs="Times New Roman"/>
+          <w:color w:val="D4D4D4"/>
+          <w:sz w:val="21"/>
+          <w:szCs w:val="21"/>
+        </w:rPr>
+        <w:t>      }</w:t>
+      </w:r>
+    </w:p>
+    <w:p/>
+    <w:p>
+      <w:r>
+        <w:t>Here this .</w:t>
+      </w:r>
+      <w:proofErr w:type="spellStart"/>
+      <w:r>
+        <w:t>aricles</w:t>
+      </w:r>
+      <w:proofErr w:type="spellEnd"/>
+      <w:r>
+        <w:t xml:space="preserve"> is a </w:t>
+      </w:r>
+      <w:proofErr w:type="spellStart"/>
+      <w:r>
+        <w:t>varible</w:t>
+      </w:r>
+      <w:proofErr w:type="spellEnd"/>
+      <w:r>
+        <w:t xml:space="preserve"> </w:t>
+      </w:r>
+      <w:proofErr w:type="spellStart"/>
+      <w:r>
+        <w:t>declaired</w:t>
+      </w:r>
+      <w:proofErr w:type="spellEnd"/>
+      <w:r>
+        <w:t xml:space="preserve"> before.</w:t>
+      </w:r>
+    </w:p>
+    <w:p>
+      <w:r>
+        <w:t xml:space="preserve">If this variable is a dictionary then we can loop through it using map function. We can use same map function in </w:t>
+      </w:r>
+      <w:proofErr w:type="gramStart"/>
+      <w:r>
+        <w:t>class based</w:t>
+      </w:r>
+      <w:proofErr w:type="gramEnd"/>
+      <w:r>
+        <w:t xml:space="preserve"> components also.</w:t>
+      </w:r>
+    </w:p>
+    <w:p>
+      <w:r>
+        <w:t>Example is as following.</w:t>
+      </w:r>
+    </w:p>
+    <w:p>
+      <w:pPr>
+        <w:shd w:val="clear" w:color="auto" w:fill="1E1E1E"/>
+        <w:spacing w:after="0" w:line="285" w:lineRule="atLeast"/>
+        <w:rPr>
+          <w:rFonts w:ascii="Consolas" w:eastAsia="Times New Roman" w:hAnsi="Consolas" w:cs="Times New Roman"/>
+          <w:color w:val="D4D4D4"/>
+          <w:sz w:val="21"/>
+          <w:szCs w:val="21"/>
+        </w:rPr>
+      </w:pPr>
+      <w:r>
+        <w:rPr>
+          <w:rFonts w:ascii="Consolas" w:eastAsia="Times New Roman" w:hAnsi="Consolas" w:cs="Times New Roman"/>
+          <w:color w:val="569CD6"/>
+          <w:sz w:val="21"/>
+          <w:szCs w:val="21"/>
+        </w:rPr>
+        <w:t>{</w:t>
+      </w:r>
+      <w:proofErr w:type="spellStart"/>
+      <w:r>
+        <w:rPr>
+          <w:rFonts w:ascii="Consolas" w:eastAsia="Times New Roman" w:hAnsi="Consolas" w:cs="Times New Roman"/>
+          <w:color w:val="569CD6"/>
+          <w:sz w:val="21"/>
+          <w:szCs w:val="21"/>
+        </w:rPr>
+        <w:t>this</w:t>
+      </w:r>
+      <w:r>
+        <w:rPr>
+          <w:rFonts w:ascii="Consolas" w:eastAsia="Times New Roman" w:hAnsi="Consolas" w:cs="Times New Roman"/>
+          <w:color w:val="D4D4D4"/>
+          <w:sz w:val="21"/>
+          <w:szCs w:val="21"/>
+        </w:rPr>
+        <w:t>.</w:t>
+      </w:r>
+      <w:r>
+        <w:rPr>
+          <w:rFonts w:ascii="Consolas" w:eastAsia="Times New Roman" w:hAnsi="Consolas" w:cs="Times New Roman"/>
+          <w:color w:val="C8C8C8"/>
+          <w:sz w:val="21"/>
+          <w:szCs w:val="21"/>
+        </w:rPr>
+        <w:t>state</w:t>
+      </w:r>
+      <w:r>
+        <w:rPr>
+          <w:rFonts w:ascii="Consolas" w:eastAsia="Times New Roman" w:hAnsi="Consolas" w:cs="Times New Roman"/>
+          <w:color w:val="D4D4D4"/>
+          <w:sz w:val="21"/>
+          <w:szCs w:val="21"/>
+        </w:rPr>
+        <w:t>.</w:t>
+      </w:r>
+      <w:r>
+        <w:rPr>
+          <w:rFonts w:ascii="Consolas" w:eastAsia="Times New Roman" w:hAnsi="Consolas" w:cs="Times New Roman"/>
+          <w:color w:val="C8C8C8"/>
+          <w:sz w:val="21"/>
+          <w:szCs w:val="21"/>
+        </w:rPr>
+        <w:t>articles</w:t>
+      </w:r>
+      <w:r>
+        <w:rPr>
+          <w:rFonts w:ascii="Consolas" w:eastAsia="Times New Roman" w:hAnsi="Consolas" w:cs="Times New Roman"/>
+          <w:color w:val="D4D4D4"/>
+          <w:sz w:val="21"/>
+          <w:szCs w:val="21"/>
+        </w:rPr>
+        <w:t>.</w:t>
+      </w:r>
+      <w:r>
+        <w:rPr>
+          <w:rFonts w:ascii="Consolas" w:eastAsia="Times New Roman" w:hAnsi="Consolas" w:cs="Times New Roman"/>
+          <w:color w:val="C8C8C8"/>
+          <w:sz w:val="21"/>
+          <w:szCs w:val="21"/>
+        </w:rPr>
+        <w:t>map</w:t>
+      </w:r>
+      <w:proofErr w:type="spellEnd"/>
+      <w:r>
+        <w:rPr>
+          <w:rFonts w:ascii="Consolas" w:eastAsia="Times New Roman" w:hAnsi="Consolas" w:cs="Times New Roman"/>
+          <w:color w:val="D4D4D4"/>
+          <w:sz w:val="21"/>
+          <w:szCs w:val="21"/>
+        </w:rPr>
+        <w:t>((</w:t>
+      </w:r>
+      <w:proofErr w:type="spellStart"/>
+      <w:r>
+        <w:rPr>
+          <w:rFonts w:ascii="Consolas" w:eastAsia="Times New Roman" w:hAnsi="Consolas" w:cs="Times New Roman"/>
+          <w:color w:val="7F7F7F"/>
+          <w:sz w:val="21"/>
+          <w:szCs w:val="21"/>
+        </w:rPr>
+        <w:t>ele</w:t>
+      </w:r>
+      <w:proofErr w:type="spellEnd"/>
+      <w:r>
+        <w:rPr>
+          <w:rFonts w:ascii="Consolas" w:eastAsia="Times New Roman" w:hAnsi="Consolas" w:cs="Times New Roman"/>
+          <w:color w:val="D4D4D4"/>
+          <w:sz w:val="21"/>
+          <w:szCs w:val="21"/>
+        </w:rPr>
+        <w:t xml:space="preserve">) </w:t>
+      </w:r>
+      <w:r>
+        <w:rPr>
+          <w:rFonts w:ascii="Consolas" w:eastAsia="Times New Roman" w:hAnsi="Consolas" w:cs="Times New Roman"/>
+          <w:color w:val="569CD6"/>
+          <w:sz w:val="21"/>
+          <w:szCs w:val="21"/>
+        </w:rPr>
+        <w:t>=&gt;</w:t>
+      </w:r>
+      <w:r>
+        <w:rPr>
+          <w:rFonts w:ascii="Consolas" w:eastAsia="Times New Roman" w:hAnsi="Consolas" w:cs="Times New Roman"/>
+          <w:color w:val="D4D4D4"/>
+          <w:sz w:val="21"/>
+          <w:szCs w:val="21"/>
+        </w:rPr>
+        <w:t xml:space="preserve"> {</w:t>
+      </w:r>
+    </w:p>
+    <w:p>
+      <w:pPr>
+        <w:shd w:val="clear" w:color="auto" w:fill="1E1E1E"/>
+        <w:spacing w:after="0" w:line="285" w:lineRule="atLeast"/>
+        <w:rPr>
+          <w:rFonts w:ascii="Consolas" w:eastAsia="Times New Roman" w:hAnsi="Consolas" w:cs="Times New Roman"/>
+          <w:color w:val="D4D4D4"/>
+          <w:sz w:val="21"/>
+          <w:szCs w:val="21"/>
+        </w:rPr>
+      </w:pPr>
+      <w:r>
+        <w:rPr>
+          <w:rFonts w:ascii="Consolas" w:eastAsia="Times New Roman" w:hAnsi="Consolas" w:cs="Times New Roman"/>
+          <w:color w:val="D4D4D4"/>
+          <w:sz w:val="21"/>
+          <w:szCs w:val="21"/>
+        </w:rPr>
+        <w:t xml:space="preserve">            </w:t>
+      </w:r>
+      <w:r>
+        <w:rPr>
+          <w:rFonts w:ascii="Consolas" w:eastAsia="Times New Roman" w:hAnsi="Consolas" w:cs="Times New Roman"/>
+          <w:color w:val="569CD6"/>
+          <w:sz w:val="21"/>
+          <w:szCs w:val="21"/>
+        </w:rPr>
+        <w:t>return</w:t>
+      </w:r>
+      <w:r>
+        <w:rPr>
+          <w:rFonts w:ascii="Consolas" w:eastAsia="Times New Roman" w:hAnsi="Consolas" w:cs="Times New Roman"/>
+          <w:color w:val="D4D4D4"/>
+          <w:sz w:val="21"/>
+          <w:szCs w:val="21"/>
+        </w:rPr>
+        <w:t xml:space="preserve"> </w:t>
+      </w:r>
+      <w:r>
+        <w:rPr>
+          <w:rFonts w:ascii="Consolas" w:eastAsia="Times New Roman" w:hAnsi="Consolas" w:cs="Times New Roman"/>
+          <w:color w:val="808080"/>
+          <w:sz w:val="21"/>
+          <w:szCs w:val="21"/>
+        </w:rPr>
+        <w:t>&lt;</w:t>
+      </w:r>
+      <w:r>
+        <w:rPr>
+          <w:rFonts w:ascii="Consolas" w:eastAsia="Times New Roman" w:hAnsi="Consolas" w:cs="Times New Roman"/>
+          <w:color w:val="569CD6"/>
+          <w:sz w:val="21"/>
+          <w:szCs w:val="21"/>
+        </w:rPr>
+        <w:t>div</w:t>
+      </w:r>
+      <w:r>
+        <w:rPr>
+          <w:rFonts w:ascii="Consolas" w:eastAsia="Times New Roman" w:hAnsi="Consolas" w:cs="Times New Roman"/>
+          <w:color w:val="D4D4D4"/>
+          <w:sz w:val="21"/>
+          <w:szCs w:val="21"/>
+        </w:rPr>
+        <w:t xml:space="preserve"> </w:t>
+      </w:r>
+      <w:proofErr w:type="spellStart"/>
+      <w:r>
+        <w:rPr>
+          <w:rFonts w:ascii="Consolas" w:eastAsia="Times New Roman" w:hAnsi="Consolas" w:cs="Times New Roman"/>
+          <w:color w:val="9CDCFE"/>
+          <w:sz w:val="21"/>
+          <w:szCs w:val="21"/>
+        </w:rPr>
+        <w:t>className</w:t>
+      </w:r>
+      <w:proofErr w:type="spellEnd"/>
+      <w:r>
+        <w:rPr>
+          <w:rFonts w:ascii="Consolas" w:eastAsia="Times New Roman" w:hAnsi="Consolas" w:cs="Times New Roman"/>
+          <w:color w:val="B4B4B4"/>
+          <w:sz w:val="21"/>
+          <w:szCs w:val="21"/>
+        </w:rPr>
+        <w:t>=</w:t>
+      </w:r>
+      <w:r>
+        <w:rPr>
+          <w:rFonts w:ascii="Consolas" w:eastAsia="Times New Roman" w:hAnsi="Consolas" w:cs="Times New Roman"/>
+          <w:color w:val="D69D85"/>
+          <w:sz w:val="21"/>
+          <w:szCs w:val="21"/>
+        </w:rPr>
+        <w:t>"col-md-4 my-3"</w:t>
+      </w:r>
+      <w:r>
+        <w:rPr>
+          <w:rFonts w:ascii="Consolas" w:eastAsia="Times New Roman" w:hAnsi="Consolas" w:cs="Times New Roman"/>
+          <w:color w:val="808080"/>
+          <w:sz w:val="21"/>
+          <w:szCs w:val="21"/>
+        </w:rPr>
+        <w:t>&gt;</w:t>
+      </w:r>
+    </w:p>
+    <w:p>
+      <w:pPr>
+        <w:shd w:val="clear" w:color="auto" w:fill="1E1E1E"/>
+        <w:spacing w:after="0" w:line="285" w:lineRule="atLeast"/>
+        <w:rPr>
+          <w:rFonts w:ascii="Consolas" w:eastAsia="Times New Roman" w:hAnsi="Consolas" w:cs="Times New Roman"/>
+          <w:color w:val="D4D4D4"/>
+          <w:sz w:val="21"/>
+          <w:szCs w:val="21"/>
+        </w:rPr>
+      </w:pPr>
+      <w:r>
+        <w:rPr>
+          <w:rFonts w:ascii="Consolas" w:eastAsia="Times New Roman" w:hAnsi="Consolas" w:cs="Times New Roman"/>
+          <w:color w:val="D4D4D4"/>
+          <w:sz w:val="21"/>
+          <w:szCs w:val="21"/>
+        </w:rPr>
+        <w:t xml:space="preserve">              </w:t>
+      </w:r>
+      <w:r>
+        <w:rPr>
+          <w:rFonts w:ascii="Consolas" w:eastAsia="Times New Roman" w:hAnsi="Consolas" w:cs="Times New Roman"/>
+          <w:color w:val="569CD6"/>
+          <w:sz w:val="21"/>
+          <w:szCs w:val="21"/>
+        </w:rPr>
+        <w:t>{</w:t>
+      </w:r>
+      <w:r>
+        <w:rPr>
+          <w:rFonts w:ascii="Consolas" w:eastAsia="Times New Roman" w:hAnsi="Consolas" w:cs="Times New Roman"/>
+          <w:color w:val="57A64A"/>
+          <w:sz w:val="21"/>
+          <w:szCs w:val="21"/>
+        </w:rPr>
+        <w:t xml:space="preserve">/* we are passing props, of </w:t>
+      </w:r>
+      <w:proofErr w:type="spellStart"/>
+      <w:r>
+        <w:rPr>
+          <w:rFonts w:ascii="Consolas" w:eastAsia="Times New Roman" w:hAnsi="Consolas" w:cs="Times New Roman"/>
+          <w:color w:val="57A64A"/>
+          <w:sz w:val="21"/>
+          <w:szCs w:val="21"/>
+        </w:rPr>
+        <w:t>json</w:t>
+      </w:r>
+      <w:proofErr w:type="spellEnd"/>
+      <w:r>
+        <w:rPr>
+          <w:rFonts w:ascii="Consolas" w:eastAsia="Times New Roman" w:hAnsi="Consolas" w:cs="Times New Roman"/>
+          <w:color w:val="57A64A"/>
+          <w:sz w:val="21"/>
+          <w:szCs w:val="21"/>
+        </w:rPr>
+        <w:t xml:space="preserve"> that are related to </w:t>
+      </w:r>
+      <w:proofErr w:type="spellStart"/>
+      <w:r>
+        <w:rPr>
+          <w:rFonts w:ascii="Consolas" w:eastAsia="Times New Roman" w:hAnsi="Consolas" w:cs="Times New Roman"/>
+          <w:color w:val="57A64A"/>
+          <w:sz w:val="21"/>
+          <w:szCs w:val="21"/>
+        </w:rPr>
+        <w:t>ele</w:t>
+      </w:r>
+      <w:proofErr w:type="spellEnd"/>
+      <w:r>
+        <w:rPr>
+          <w:rFonts w:ascii="Consolas" w:eastAsia="Times New Roman" w:hAnsi="Consolas" w:cs="Times New Roman"/>
+          <w:color w:val="57A64A"/>
+          <w:sz w:val="21"/>
+          <w:szCs w:val="21"/>
+        </w:rPr>
+        <w:t xml:space="preserve"> to the item card */</w:t>
+      </w:r>
+      <w:r>
+        <w:rPr>
+          <w:rFonts w:ascii="Consolas" w:eastAsia="Times New Roman" w:hAnsi="Consolas" w:cs="Times New Roman"/>
+          <w:color w:val="569CD6"/>
+          <w:sz w:val="21"/>
+          <w:szCs w:val="21"/>
+        </w:rPr>
+        <w:t>}</w:t>
+      </w:r>
+    </w:p>
+    <w:p>
+      <w:pPr>
+        <w:shd w:val="clear" w:color="auto" w:fill="1E1E1E"/>
+        <w:spacing w:after="0" w:line="285" w:lineRule="atLeast"/>
+        <w:rPr>
+          <w:rFonts w:ascii="Consolas" w:eastAsia="Times New Roman" w:hAnsi="Consolas" w:cs="Times New Roman"/>
+          <w:color w:val="D4D4D4"/>
+          <w:sz w:val="21"/>
+          <w:szCs w:val="21"/>
+        </w:rPr>
+      </w:pPr>
+      <w:r>
+        <w:rPr>
+          <w:rFonts w:ascii="Consolas" w:eastAsia="Times New Roman" w:hAnsi="Consolas" w:cs="Times New Roman"/>
+          <w:color w:val="D4D4D4"/>
+          <w:sz w:val="21"/>
+          <w:szCs w:val="21"/>
+        </w:rPr>
+        <w:t xml:space="preserve">              </w:t>
+      </w:r>
+      <w:r>
+        <w:rPr>
+          <w:rFonts w:ascii="Consolas" w:eastAsia="Times New Roman" w:hAnsi="Consolas" w:cs="Times New Roman"/>
+          <w:color w:val="808080"/>
+          <w:sz w:val="21"/>
+          <w:szCs w:val="21"/>
+        </w:rPr>
+        <w:t>&lt;</w:t>
+      </w:r>
+      <w:proofErr w:type="spellStart"/>
+      <w:r>
+        <w:rPr>
+          <w:rFonts w:ascii="Consolas" w:eastAsia="Times New Roman" w:hAnsi="Consolas" w:cs="Times New Roman"/>
+          <w:color w:val="569CD6"/>
+          <w:sz w:val="21"/>
+          <w:szCs w:val="21"/>
+        </w:rPr>
+        <w:t>NewsItem</w:t>
+      </w:r>
+      <w:proofErr w:type="spellEnd"/>
+      <w:r>
+        <w:rPr>
+          <w:rFonts w:ascii="Consolas" w:eastAsia="Times New Roman" w:hAnsi="Consolas" w:cs="Times New Roman"/>
+          <w:color w:val="D4D4D4"/>
+          <w:sz w:val="21"/>
+          <w:szCs w:val="21"/>
+        </w:rPr>
+        <w:t xml:space="preserve"> </w:t>
+      </w:r>
+      <w:r>
+        <w:rPr>
+          <w:rFonts w:ascii="Consolas" w:eastAsia="Times New Roman" w:hAnsi="Consolas" w:cs="Times New Roman"/>
+          <w:color w:val="9CDCFE"/>
+          <w:sz w:val="21"/>
+          <w:szCs w:val="21"/>
+        </w:rPr>
+        <w:t>key</w:t>
+      </w:r>
+      <w:r>
+        <w:rPr>
+          <w:rFonts w:ascii="Consolas" w:eastAsia="Times New Roman" w:hAnsi="Consolas" w:cs="Times New Roman"/>
+          <w:color w:val="B4B4B4"/>
+          <w:sz w:val="21"/>
+          <w:szCs w:val="21"/>
+        </w:rPr>
+        <w:t>=</w:t>
+      </w:r>
+      <w:r>
+        <w:rPr>
+          <w:rFonts w:ascii="Consolas" w:eastAsia="Times New Roman" w:hAnsi="Consolas" w:cs="Times New Roman"/>
+          <w:color w:val="569CD6"/>
+          <w:sz w:val="21"/>
+          <w:szCs w:val="21"/>
+        </w:rPr>
+        <w:t>{</w:t>
+      </w:r>
+      <w:r>
+        <w:rPr>
+          <w:rFonts w:ascii="Consolas" w:eastAsia="Times New Roman" w:hAnsi="Consolas" w:cs="Times New Roman"/>
+          <w:color w:val="C8C8C8"/>
+          <w:sz w:val="21"/>
+          <w:szCs w:val="21"/>
+        </w:rPr>
+        <w:t>ele</w:t>
+      </w:r>
+      <w:r>
+        <w:rPr>
+          <w:rFonts w:ascii="Consolas" w:eastAsia="Times New Roman" w:hAnsi="Consolas" w:cs="Times New Roman"/>
+          <w:color w:val="D4D4D4"/>
+          <w:sz w:val="21"/>
+          <w:szCs w:val="21"/>
+        </w:rPr>
+        <w:t>.</w:t>
+      </w:r>
+      <w:r>
+        <w:rPr>
+          <w:rFonts w:ascii="Consolas" w:eastAsia="Times New Roman" w:hAnsi="Consolas" w:cs="Times New Roman"/>
+          <w:color w:val="DADADA"/>
+          <w:sz w:val="21"/>
+          <w:szCs w:val="21"/>
+        </w:rPr>
+        <w:t>url</w:t>
+      </w:r>
+      <w:r>
+        <w:rPr>
+          <w:rFonts w:ascii="Consolas" w:eastAsia="Times New Roman" w:hAnsi="Consolas" w:cs="Times New Roman"/>
+          <w:color w:val="569CD6"/>
+          <w:sz w:val="21"/>
+          <w:szCs w:val="21"/>
+        </w:rPr>
+        <w:t>}</w:t>
+      </w:r>
+      <w:r>
+        <w:rPr>
+          <w:rFonts w:ascii="Consolas" w:eastAsia="Times New Roman" w:hAnsi="Consolas" w:cs="Times New Roman"/>
+          <w:color w:val="D4D4D4"/>
+          <w:sz w:val="21"/>
+          <w:szCs w:val="21"/>
+        </w:rPr>
+        <w:t xml:space="preserve"> </w:t>
+      </w:r>
+      <w:r>
+        <w:rPr>
+          <w:rFonts w:ascii="Consolas" w:eastAsia="Times New Roman" w:hAnsi="Consolas" w:cs="Times New Roman"/>
+          <w:color w:val="9CDCFE"/>
+          <w:sz w:val="21"/>
+          <w:szCs w:val="21"/>
+        </w:rPr>
+        <w:t>title</w:t>
+      </w:r>
+      <w:r>
+        <w:rPr>
+          <w:rFonts w:ascii="Consolas" w:eastAsia="Times New Roman" w:hAnsi="Consolas" w:cs="Times New Roman"/>
+          <w:color w:val="B4B4B4"/>
+          <w:sz w:val="21"/>
+          <w:szCs w:val="21"/>
+        </w:rPr>
+        <w:t>=</w:t>
+      </w:r>
+      <w:r>
+        <w:rPr>
+          <w:rFonts w:ascii="Consolas" w:eastAsia="Times New Roman" w:hAnsi="Consolas" w:cs="Times New Roman"/>
+          <w:color w:val="569CD6"/>
+          <w:sz w:val="21"/>
+          <w:szCs w:val="21"/>
+        </w:rPr>
+        <w:t>{</w:t>
+      </w:r>
+      <w:proofErr w:type="spellStart"/>
+      <w:r>
+        <w:rPr>
+          <w:rFonts w:ascii="Consolas" w:eastAsia="Times New Roman" w:hAnsi="Consolas" w:cs="Times New Roman"/>
+          <w:color w:val="C8C8C8"/>
+          <w:sz w:val="21"/>
+          <w:szCs w:val="21"/>
+        </w:rPr>
+        <w:t>ele</w:t>
+      </w:r>
+      <w:r>
+        <w:rPr>
+          <w:rFonts w:ascii="Consolas" w:eastAsia="Times New Roman" w:hAnsi="Consolas" w:cs="Times New Roman"/>
+          <w:color w:val="D4D4D4"/>
+          <w:sz w:val="21"/>
+          <w:szCs w:val="21"/>
+        </w:rPr>
+        <w:t>.</w:t>
+      </w:r>
+      <w:r>
+        <w:rPr>
+          <w:rFonts w:ascii="Consolas" w:eastAsia="Times New Roman" w:hAnsi="Consolas" w:cs="Times New Roman"/>
+          <w:color w:val="DADADA"/>
+          <w:sz w:val="21"/>
+          <w:szCs w:val="21"/>
+        </w:rPr>
+        <w:t>title</w:t>
+      </w:r>
+      <w:proofErr w:type="spellEnd"/>
+      <w:r>
+        <w:rPr>
+          <w:rFonts w:ascii="Consolas" w:eastAsia="Times New Roman" w:hAnsi="Consolas" w:cs="Times New Roman"/>
+          <w:color w:val="569CD6"/>
+          <w:sz w:val="21"/>
+          <w:szCs w:val="21"/>
+        </w:rPr>
+        <w:t>}</w:t>
+      </w:r>
+      <w:r>
+        <w:rPr>
+          <w:rFonts w:ascii="Consolas" w:eastAsia="Times New Roman" w:hAnsi="Consolas" w:cs="Times New Roman"/>
+          <w:color w:val="D4D4D4"/>
+          <w:sz w:val="21"/>
+          <w:szCs w:val="21"/>
+        </w:rPr>
+        <w:t xml:space="preserve"> </w:t>
+      </w:r>
+      <w:r>
+        <w:rPr>
+          <w:rFonts w:ascii="Consolas" w:eastAsia="Times New Roman" w:hAnsi="Consolas" w:cs="Times New Roman"/>
+          <w:color w:val="9CDCFE"/>
+          <w:sz w:val="21"/>
+          <w:szCs w:val="21"/>
+        </w:rPr>
+        <w:t>description</w:t>
+      </w:r>
+      <w:r>
+        <w:rPr>
+          <w:rFonts w:ascii="Consolas" w:eastAsia="Times New Roman" w:hAnsi="Consolas" w:cs="Times New Roman"/>
+          <w:color w:val="B4B4B4"/>
+          <w:sz w:val="21"/>
+          <w:szCs w:val="21"/>
+        </w:rPr>
+        <w:t>=</w:t>
+      </w:r>
+      <w:r>
+        <w:rPr>
+          <w:rFonts w:ascii="Consolas" w:eastAsia="Times New Roman" w:hAnsi="Consolas" w:cs="Times New Roman"/>
+          <w:color w:val="569CD6"/>
+          <w:sz w:val="21"/>
+          <w:szCs w:val="21"/>
+        </w:rPr>
+        <w:t>{</w:t>
+      </w:r>
+      <w:proofErr w:type="spellStart"/>
+      <w:r>
+        <w:rPr>
+          <w:rFonts w:ascii="Consolas" w:eastAsia="Times New Roman" w:hAnsi="Consolas" w:cs="Times New Roman"/>
+          <w:color w:val="C8C8C8"/>
+          <w:sz w:val="21"/>
+          <w:szCs w:val="21"/>
+        </w:rPr>
+        <w:t>ele</w:t>
+      </w:r>
+      <w:r>
+        <w:rPr>
+          <w:rFonts w:ascii="Consolas" w:eastAsia="Times New Roman" w:hAnsi="Consolas" w:cs="Times New Roman"/>
+          <w:color w:val="D4D4D4"/>
+          <w:sz w:val="21"/>
+          <w:szCs w:val="21"/>
+        </w:rPr>
+        <w:t>.</w:t>
+      </w:r>
+      <w:r>
+        <w:rPr>
+          <w:rFonts w:ascii="Consolas" w:eastAsia="Times New Roman" w:hAnsi="Consolas" w:cs="Times New Roman"/>
+          <w:color w:val="DADADA"/>
+          <w:sz w:val="21"/>
+          <w:szCs w:val="21"/>
+        </w:rPr>
+        <w:t>description</w:t>
+      </w:r>
+      <w:proofErr w:type="spellEnd"/>
+      <w:r>
+        <w:rPr>
+          <w:rFonts w:ascii="Consolas" w:eastAsia="Times New Roman" w:hAnsi="Consolas" w:cs="Times New Roman"/>
+          <w:color w:val="569CD6"/>
+          <w:sz w:val="21"/>
+          <w:szCs w:val="21"/>
+        </w:rPr>
+        <w:t>}</w:t>
+      </w:r>
+      <w:r>
+        <w:rPr>
+          <w:rFonts w:ascii="Consolas" w:eastAsia="Times New Roman" w:hAnsi="Consolas" w:cs="Times New Roman"/>
+          <w:color w:val="D4D4D4"/>
+          <w:sz w:val="21"/>
+          <w:szCs w:val="21"/>
+        </w:rPr>
+        <w:t xml:space="preserve"> </w:t>
+      </w:r>
+      <w:proofErr w:type="spellStart"/>
+      <w:r>
+        <w:rPr>
+          <w:rFonts w:ascii="Consolas" w:eastAsia="Times New Roman" w:hAnsi="Consolas" w:cs="Times New Roman"/>
+          <w:color w:val="9CDCFE"/>
+          <w:sz w:val="21"/>
+          <w:szCs w:val="21"/>
+        </w:rPr>
+        <w:t>imageUrl</w:t>
+      </w:r>
+      <w:proofErr w:type="spellEnd"/>
+      <w:r>
+        <w:rPr>
+          <w:rFonts w:ascii="Consolas" w:eastAsia="Times New Roman" w:hAnsi="Consolas" w:cs="Times New Roman"/>
+          <w:color w:val="B4B4B4"/>
+          <w:sz w:val="21"/>
+          <w:szCs w:val="21"/>
+        </w:rPr>
+        <w:t>=</w:t>
+      </w:r>
+      <w:r>
+        <w:rPr>
+          <w:rFonts w:ascii="Consolas" w:eastAsia="Times New Roman" w:hAnsi="Consolas" w:cs="Times New Roman"/>
+          <w:color w:val="569CD6"/>
+          <w:sz w:val="21"/>
+          <w:szCs w:val="21"/>
+        </w:rPr>
+        <w:t>{</w:t>
+      </w:r>
+      <w:proofErr w:type="spellStart"/>
+      <w:r>
+        <w:rPr>
+          <w:rFonts w:ascii="Consolas" w:eastAsia="Times New Roman" w:hAnsi="Consolas" w:cs="Times New Roman"/>
+          <w:color w:val="C8C8C8"/>
+          <w:sz w:val="21"/>
+          <w:szCs w:val="21"/>
+        </w:rPr>
+        <w:t>ele</w:t>
+      </w:r>
+      <w:r>
+        <w:rPr>
+          <w:rFonts w:ascii="Consolas" w:eastAsia="Times New Roman" w:hAnsi="Consolas" w:cs="Times New Roman"/>
+          <w:color w:val="D4D4D4"/>
+          <w:sz w:val="21"/>
+          <w:szCs w:val="21"/>
+        </w:rPr>
+        <w:t>.</w:t>
+      </w:r>
+      <w:r>
+        <w:rPr>
+          <w:rFonts w:ascii="Consolas" w:eastAsia="Times New Roman" w:hAnsi="Consolas" w:cs="Times New Roman"/>
+          <w:color w:val="DADADA"/>
+          <w:sz w:val="21"/>
+          <w:szCs w:val="21"/>
+        </w:rPr>
+        <w:t>urlToImage</w:t>
+      </w:r>
+      <w:proofErr w:type="spellEnd"/>
+      <w:r>
+        <w:rPr>
+          <w:rFonts w:ascii="Consolas" w:eastAsia="Times New Roman" w:hAnsi="Consolas" w:cs="Times New Roman"/>
+          <w:color w:val="569CD6"/>
+          <w:sz w:val="21"/>
+          <w:szCs w:val="21"/>
+        </w:rPr>
+        <w:t>}</w:t>
+      </w:r>
+      <w:r>
+        <w:rPr>
+          <w:rFonts w:ascii="Consolas" w:eastAsia="Times New Roman" w:hAnsi="Consolas" w:cs="Times New Roman"/>
+          <w:color w:val="D4D4D4"/>
+          <w:sz w:val="21"/>
+          <w:szCs w:val="21"/>
+        </w:rPr>
+        <w:t xml:space="preserve"> </w:t>
+      </w:r>
+      <w:proofErr w:type="spellStart"/>
+      <w:r>
+        <w:rPr>
+          <w:rFonts w:ascii="Consolas" w:eastAsia="Times New Roman" w:hAnsi="Consolas" w:cs="Times New Roman"/>
+          <w:color w:val="9CDCFE"/>
+          <w:sz w:val="21"/>
+          <w:szCs w:val="21"/>
+        </w:rPr>
+        <w:t>newsUrl</w:t>
+      </w:r>
+      <w:proofErr w:type="spellEnd"/>
+      <w:r>
+        <w:rPr>
+          <w:rFonts w:ascii="Consolas" w:eastAsia="Times New Roman" w:hAnsi="Consolas" w:cs="Times New Roman"/>
+          <w:color w:val="B4B4B4"/>
+          <w:sz w:val="21"/>
+          <w:szCs w:val="21"/>
+        </w:rPr>
+        <w:t>=</w:t>
+      </w:r>
+      <w:r>
+        <w:rPr>
+          <w:rFonts w:ascii="Consolas" w:eastAsia="Times New Roman" w:hAnsi="Consolas" w:cs="Times New Roman"/>
+          <w:color w:val="D69D85"/>
+          <w:sz w:val="21"/>
+          <w:szCs w:val="21"/>
+        </w:rPr>
+        <w:t>"Todo"</w:t>
+      </w:r>
+      <w:r>
+        <w:rPr>
+          <w:rFonts w:ascii="Consolas" w:eastAsia="Times New Roman" w:hAnsi="Consolas" w:cs="Times New Roman"/>
+          <w:color w:val="808080"/>
+          <w:sz w:val="21"/>
+          <w:szCs w:val="21"/>
+        </w:rPr>
+        <w:t>/&gt;</w:t>
+      </w:r>
+    </w:p>
+    <w:p>
+      <w:pPr>
+        <w:shd w:val="clear" w:color="auto" w:fill="1E1E1E"/>
+        <w:spacing w:after="0" w:line="285" w:lineRule="atLeast"/>
+        <w:rPr>
+          <w:rFonts w:ascii="Consolas" w:eastAsia="Times New Roman" w:hAnsi="Consolas" w:cs="Times New Roman"/>
+          <w:color w:val="D4D4D4"/>
+          <w:sz w:val="21"/>
+          <w:szCs w:val="21"/>
+        </w:rPr>
+      </w:pPr>
+      <w:r>
+        <w:rPr>
+          <w:rFonts w:ascii="Consolas" w:eastAsia="Times New Roman" w:hAnsi="Consolas" w:cs="Times New Roman"/>
+          <w:color w:val="D4D4D4"/>
+          <w:sz w:val="21"/>
+          <w:szCs w:val="21"/>
+        </w:rPr>
+        <w:t xml:space="preserve">          </w:t>
+      </w:r>
+      <w:r>
+        <w:rPr>
+          <w:rFonts w:ascii="Consolas" w:eastAsia="Times New Roman" w:hAnsi="Consolas" w:cs="Times New Roman"/>
+          <w:color w:val="808080"/>
+          <w:sz w:val="21"/>
+          <w:szCs w:val="21"/>
+        </w:rPr>
+        <w:t>&lt;/</w:t>
+      </w:r>
+      <w:r>
+        <w:rPr>
+          <w:rFonts w:ascii="Consolas" w:eastAsia="Times New Roman" w:hAnsi="Consolas" w:cs="Times New Roman"/>
+          <w:color w:val="569CD6"/>
+          <w:sz w:val="21"/>
+          <w:szCs w:val="21"/>
+        </w:rPr>
+        <w:t>div</w:t>
+      </w:r>
+      <w:r>
+        <w:rPr>
+          <w:rFonts w:ascii="Consolas" w:eastAsia="Times New Roman" w:hAnsi="Consolas" w:cs="Times New Roman"/>
+          <w:color w:val="808080"/>
+          <w:sz w:val="21"/>
+          <w:szCs w:val="21"/>
+        </w:rPr>
+        <w:t>&gt;</w:t>
+      </w:r>
+    </w:p>
+    <w:p>
+      <w:pPr>
+        <w:shd w:val="clear" w:color="auto" w:fill="1E1E1E"/>
+        <w:spacing w:after="0" w:line="285" w:lineRule="atLeast"/>
+        <w:rPr>
+          <w:rFonts w:ascii="Consolas" w:eastAsia="Times New Roman" w:hAnsi="Consolas" w:cs="Times New Roman"/>
+          <w:color w:val="D4D4D4"/>
+          <w:sz w:val="21"/>
+          <w:szCs w:val="21"/>
+        </w:rPr>
+      </w:pPr>
+      <w:r>
+        <w:rPr>
+          <w:rFonts w:ascii="Consolas" w:eastAsia="Times New Roman" w:hAnsi="Consolas" w:cs="Times New Roman"/>
+          <w:color w:val="D4D4D4"/>
+          <w:sz w:val="21"/>
+          <w:szCs w:val="21"/>
+        </w:rPr>
+        <w:t>          })</w:t>
+      </w:r>
+      <w:r>
+        <w:rPr>
+          <w:rFonts w:ascii="Consolas" w:eastAsia="Times New Roman" w:hAnsi="Consolas" w:cs="Times New Roman"/>
+          <w:color w:val="569CD6"/>
+          <w:sz w:val="21"/>
+          <w:szCs w:val="21"/>
+        </w:rPr>
+        <w:t>}</w:t>
+      </w:r>
+    </w:p>
+    <w:p>
+      <w:pPr>
+        <w:shd w:val="clear" w:color="auto" w:fill="1E1E1E"/>
+        <w:spacing w:after="0" w:line="285" w:lineRule="atLeast"/>
+        <w:rPr>
+          <w:rFonts w:ascii="Consolas" w:eastAsia="Times New Roman" w:hAnsi="Consolas" w:cs="Times New Roman"/>
+          <w:color w:val="D4D4D4"/>
+          <w:sz w:val="21"/>
+          <w:szCs w:val="21"/>
+        </w:rPr>
+      </w:pPr>
+      <w:r>
+        <w:rPr>
+          <w:rFonts w:ascii="Consolas" w:eastAsia="Times New Roman" w:hAnsi="Consolas" w:cs="Times New Roman"/>
+          <w:color w:val="D4D4D4"/>
+          <w:sz w:val="21"/>
+          <w:szCs w:val="21"/>
+        </w:rPr>
+        <w:t xml:space="preserve">              </w:t>
+      </w:r>
+    </w:p>
+    <w:p/>
+    <w:p>
+      <w:r>
+        <w:t xml:space="preserve">Here arrow </w:t>
+      </w:r>
+      <w:proofErr w:type="spellStart"/>
+      <w:r>
+        <w:t>funcition</w:t>
+      </w:r>
+      <w:proofErr w:type="spellEnd"/>
+      <w:r>
+        <w:t xml:space="preserve"> is created to get each and  one element with map function.</w:t>
+      </w:r>
+    </w:p>
     <w:sectPr>
       <w:pgSz w:w="12240" w:h="15840"/>
       <w:pgMar w:top="1440" w:right="1440" w:bottom="1440" w:left="1440" w:header="720" w:footer="720" w:gutter="0"/>
@@ -448,6 +2346,25 @@
     <w:name w:val="Normal"/>
     <w:qFormat/>
   </w:style>
+  <w:style w:type="paragraph" w:styleId="Heading3">
+    <w:name w:val="heading 3"/>
+    <w:basedOn w:val="Normal"/>
+    <w:link w:val="Heading3Char"/>
+    <w:uiPriority w:val="9"/>
+    <w:qFormat/>
+    <w:rsid w:val="00872157"/>
+    <w:pPr>
+      <w:spacing w:before="100" w:beforeAutospacing="1" w:after="100" w:afterAutospacing="1" w:line="240" w:lineRule="auto"/>
+      <w:outlineLvl w:val="2"/>
+    </w:pPr>
+    <w:rPr>
+      <w:rFonts w:ascii="Times New Roman" w:eastAsia="Times New Roman" w:hAnsi="Times New Roman" w:cs="Times New Roman"/>
+      <w:b/>
+      <w:bCs/>
+      <w:sz w:val="27"/>
+      <w:szCs w:val="27"/>
+    </w:rPr>
+  </w:style>
   <w:style w:type="character" w:default="1" w:styleId="DefaultParagraphFont">
     <w:name w:val="Default Paragraph Font"/>
     <w:uiPriority w:val="1"/>
@@ -474,6 +2391,33 @@
     <w:uiPriority w:val="99"/>
     <w:semiHidden/>
     <w:unhideWhenUsed/>
+  </w:style>
+  <w:style w:type="character" w:customStyle="1" w:styleId="Heading3Char">
+    <w:name w:val="Heading 3 Char"/>
+    <w:basedOn w:val="DefaultParagraphFont"/>
+    <w:link w:val="Heading3"/>
+    <w:uiPriority w:val="9"/>
+    <w:rsid w:val="00872157"/>
+    <w:rPr>
+      <w:rFonts w:ascii="Times New Roman" w:eastAsia="Times New Roman" w:hAnsi="Times New Roman" w:cs="Times New Roman"/>
+      <w:b/>
+      <w:bCs/>
+      <w:sz w:val="27"/>
+      <w:szCs w:val="27"/>
+    </w:rPr>
+  </w:style>
+  <w:style w:type="character" w:styleId="HTMLCode">
+    <w:name w:val="HTML Code"/>
+    <w:basedOn w:val="DefaultParagraphFont"/>
+    <w:uiPriority w:val="99"/>
+    <w:semiHidden/>
+    <w:unhideWhenUsed/>
+    <w:rsid w:val="00872157"/>
+    <w:rPr>
+      <w:rFonts w:ascii="Courier New" w:eastAsia="Times New Roman" w:hAnsi="Courier New" w:cs="Courier New"/>
+      <w:sz w:val="20"/>
+      <w:szCs w:val="20"/>
+    </w:rPr>
   </w:style>
 </w:styles>
 </file>

</xml_diff>